<commit_message>
Aplicar formato ESEN de trabajo corto al documento
</commit_message>
<xml_diff>
--- a/Decisiones_de_UX_Ferre.docx
+++ b/Decisiones_de_UX_Ferre.docx
@@ -4,135 +4,351 @@
   <w:body>
     <w:p>
       <w:pPr>
-        <w:spacing w:after="100"/>
+        <w:keepNext w:val="0"/>
+        <w:keepLines w:val="0"/>
+        <w:spacing w:line="480" w:lineRule="auto" w:before="0" w:after="0"/>
+        <w:ind w:firstLine="0"/>
+        <w:jc w:val="left"/>
       </w:pPr>
       <w:r>
         <w:rPr>
-          <w:rFonts w:ascii="Aptos" w:hAnsi="Aptos"/>
-          <w:b/>
-          <w:color w:val="0066CC"/>
-          <w:sz w:val="18"/>
+          <w:rFonts w:ascii="Georgia" w:hAnsi="Georgia"/>
+          <w:b w:val="0"/>
+          <w:i w:val="0"/>
+          <w:color w:val="000000"/>
+          <w:sz w:val="22"/>
         </w:rPr>
-        <w:t>ACTIVIDAD EVALUADA   ·   PROTOTIPO FERRE</w:t>
+        <w:t>Víctor López</w:t>
       </w:r>
     </w:p>
     <w:p>
       <w:pPr>
-        <w:pStyle w:val="Title"/>
+        <w:keepNext w:val="0"/>
+        <w:keepLines w:val="0"/>
+        <w:spacing w:line="480" w:lineRule="auto" w:before="0" w:after="0"/>
+        <w:ind w:firstLine="0"/>
+        <w:jc w:val="left"/>
       </w:pPr>
       <w:r>
+        <w:rPr>
+          <w:rFonts w:ascii="Georgia" w:hAnsi="Georgia"/>
+          <w:b w:val="0"/>
+          <w:i w:val="0"/>
+          <w:color w:val="000000"/>
+          <w:sz w:val="22"/>
+        </w:rPr>
+        <w:t>Profesor/a ________________________________</w:t>
+      </w:r>
+    </w:p>
+    <w:p>
+      <w:pPr>
+        <w:keepNext w:val="0"/>
+        <w:keepLines w:val="0"/>
+        <w:spacing w:line="480" w:lineRule="auto" w:before="0" w:after="0"/>
+        <w:ind w:firstLine="0"/>
+        <w:jc w:val="left"/>
+      </w:pPr>
+      <w:r>
+        <w:rPr>
+          <w:rFonts w:ascii="Georgia" w:hAnsi="Georgia"/>
+          <w:b w:val="0"/>
+          <w:i w:val="0"/>
+          <w:color w:val="000000"/>
+          <w:sz w:val="22"/>
+        </w:rPr>
+        <w:t>Requerimientos y Prototipado</w:t>
+      </w:r>
+    </w:p>
+    <w:p>
+      <w:pPr>
+        <w:keepNext w:val="0"/>
+        <w:keepLines w:val="0"/>
+        <w:spacing w:line="480" w:lineRule="auto" w:before="0" w:after="0"/>
+        <w:ind w:firstLine="0"/>
+        <w:jc w:val="left"/>
+      </w:pPr>
+      <w:r>
+        <w:rPr>
+          <w:rFonts w:ascii="Georgia" w:hAnsi="Georgia"/>
+          <w:b w:val="0"/>
+          <w:i w:val="0"/>
+          <w:color w:val="000000"/>
+          <w:sz w:val="22"/>
+        </w:rPr>
+        <w:t>Viernes, 23 de octubre de 2026</w:t>
+      </w:r>
+    </w:p>
+    <w:p>
+      <w:pPr>
+        <w:keepNext/>
+        <w:keepLines w:val="0"/>
+        <w:spacing w:line="480" w:lineRule="auto" w:before="0" w:after="0"/>
+        <w:ind w:firstLine="0"/>
+        <w:jc w:val="center"/>
+      </w:pPr>
+      <w:r>
+        <w:rPr>
+          <w:rFonts w:ascii="Georgia" w:hAnsi="Georgia"/>
+          <w:b/>
+          <w:i w:val="0"/>
+          <w:color w:val="000000"/>
+          <w:sz w:val="22"/>
+        </w:rPr>
         <w:t>Decisiones de experiencia de usuario del prototipo Ferre</w:t>
       </w:r>
     </w:p>
     <w:p>
       <w:pPr>
-        <w:spacing w:after="280"/>
+        <w:pStyle w:val="ESENBody"/>
+        <w:keepNext w:val="0"/>
+        <w:keepLines w:val="0"/>
+        <w:spacing w:line="480" w:lineRule="auto" w:before="0" w:after="0"/>
+        <w:ind w:firstLine="720"/>
+        <w:jc w:val="left"/>
       </w:pPr>
       <w:r>
         <w:rPr>
-          <w:rFonts w:ascii="Aptos" w:hAnsi="Aptos"/>
-          <w:color w:val="6E6E73"/>
-          <w:sz w:val="24"/>
+          <w:rFonts w:ascii="Georgia" w:hAnsi="Georgia"/>
+          <w:b w:val="0"/>
+          <w:i w:val="0"/>
+          <w:color w:val="000000"/>
+          <w:sz w:val="22"/>
         </w:rPr>
-        <w:t>Explicación de dos decisiones aplicadas al flujo de compra</w:t>
-      </w:r>
-    </w:p>
-    <w:p>
-      <w:pPr>
-        <w:pStyle w:val="BodyText"/>
-      </w:pPr>
-      <w:r>
         <w:t>El prototipo permite completar una tarea de principio a fin: iniciar sesión, encontrar un producto, revisar sus opciones, agregarlo al carrito y confirmar la entrega. Las dos decisiones descritas a continuación reducen el esfuerzo necesario para avanzar y mantienen visibles los datos que afectan la compra.</w:t>
       </w:r>
     </w:p>
     <w:p>
       <w:pPr>
-        <w:pStyle w:val="Heading1"/>
+        <w:keepNext/>
+        <w:keepLines w:val="0"/>
+        <w:spacing w:line="480" w:lineRule="auto" w:before="0" w:after="0"/>
+        <w:ind w:firstLine="0"/>
+        <w:jc w:val="left"/>
       </w:pPr>
       <w:r>
-        <w:t>Decisión 1 Reducir opciones para facilitar la elección</w:t>
+        <w:rPr>
+          <w:rFonts w:ascii="Georgia" w:hAnsi="Georgia"/>
+          <w:b/>
+          <w:i w:val="0"/>
+          <w:color w:val="000000"/>
+          <w:sz w:val="22"/>
+        </w:rPr>
+        <w:t>Reducir opciones para facilitar la elección</w:t>
       </w:r>
     </w:p>
     <w:p>
       <w:pPr>
-        <w:pStyle w:val="BodyText"/>
+        <w:pStyle w:val="ESENBody"/>
+        <w:keepNext w:val="0"/>
+        <w:keepLines w:val="0"/>
+        <w:spacing w:line="480" w:lineRule="auto" w:before="0" w:after="0"/>
+        <w:ind w:firstLine="720"/>
+        <w:jc w:val="left"/>
       </w:pPr>
       <w:r>
+        <w:rPr>
+          <w:rFonts w:ascii="Georgia" w:hAnsi="Georgia"/>
+          <w:b w:val="0"/>
+          <w:i w:val="0"/>
+          <w:color w:val="000000"/>
+          <w:sz w:val="22"/>
+        </w:rPr>
         <w:t>La pantalla principal presenta tres categorías amplias y una acción principal para abrir el catálogo. En el catálogo, la búsqueda se combina con cuatro filtros breves: Todos, Herramientas, Materiales y Seguridad. Cada tarjeta conserva solamente el nombre, una descripción corta, el precio y el botón Comprar.</w:t>
       </w:r>
     </w:p>
     <w:p>
       <w:pPr>
-        <w:pStyle w:val="BodyText"/>
+        <w:pStyle w:val="ESENBody"/>
+        <w:keepNext w:val="0"/>
+        <w:keepLines w:val="0"/>
+        <w:spacing w:line="480" w:lineRule="auto" w:before="0" w:after="0"/>
+        <w:ind w:firstLine="720"/>
+        <w:jc w:val="left"/>
       </w:pPr>
       <w:r>
+        <w:rPr>
+          <w:rFonts w:ascii="Georgia" w:hAnsi="Georgia"/>
+          <w:b w:val="0"/>
+          <w:i w:val="0"/>
+          <w:color w:val="000000"/>
+          <w:sz w:val="22"/>
+        </w:rPr>
         <w:t>Esta estructura aplica la ley de Hick. El tiempo para decidir aumenta cuando una interfaz presenta demasiadas alternativas al mismo tiempo. Agrupar los productos y mostrar información progresivamente evita que la persona tenga que comparar todo el inventario desde el inicio.</w:t>
       </w:r>
     </w:p>
     <w:p>
       <w:pPr>
-        <w:pStyle w:val="BodyText"/>
+        <w:pStyle w:val="ESENBody"/>
+        <w:keepNext w:val="0"/>
+        <w:keepLines w:val="0"/>
+        <w:spacing w:line="480" w:lineRule="auto" w:before="0" w:after="0"/>
+        <w:ind w:firstLine="720"/>
+        <w:jc w:val="left"/>
       </w:pPr>
       <w:r>
+        <w:rPr>
+          <w:rFonts w:ascii="Georgia" w:hAnsi="Georgia"/>
+          <w:b w:val="0"/>
+          <w:i w:val="0"/>
+          <w:color w:val="000000"/>
+          <w:sz w:val="22"/>
+        </w:rPr>
         <w:t>El resultado esperado es una exploración más rápida. La persona puede reconocer una categoría, reducir los resultados y abrir un producto sin memorizar rutas ni revisar menús extensos.</w:t>
       </w:r>
     </w:p>
     <w:p>
       <w:pPr>
-        <w:pStyle w:val="Heading1"/>
+        <w:keepNext/>
+        <w:keepLines w:val="0"/>
+        <w:spacing w:line="480" w:lineRule="auto" w:before="0" w:after="0"/>
+        <w:ind w:firstLine="0"/>
+        <w:jc w:val="left"/>
       </w:pPr>
       <w:r>
-        <w:t>Decisión 2 Mantener visible y alcanzable la acción de compra</w:t>
+        <w:rPr>
+          <w:rFonts w:ascii="Georgia" w:hAnsi="Georgia"/>
+          <w:b/>
+          <w:i w:val="0"/>
+          <w:color w:val="000000"/>
+          <w:sz w:val="22"/>
+        </w:rPr>
+        <w:t>Mantener visible y alcanzable la acción de compra</w:t>
       </w:r>
     </w:p>
     <w:p>
       <w:pPr>
-        <w:pStyle w:val="BodyText"/>
+        <w:pStyle w:val="ESENBody"/>
+        <w:keepNext w:val="0"/>
+        <w:keepLines w:val="0"/>
+        <w:spacing w:line="480" w:lineRule="auto" w:before="0" w:after="0"/>
+        <w:ind w:firstLine="720"/>
+        <w:jc w:val="left"/>
       </w:pPr>
       <w:r>
+        <w:rPr>
+          <w:rFonts w:ascii="Georgia" w:hAnsi="Georgia"/>
+          <w:b w:val="0"/>
+          <w:i w:val="0"/>
+          <w:color w:val="000000"/>
+          <w:sz w:val="22"/>
+        </w:rPr>
         <w:t>El botón principal utiliza el mismo azul en todas las pantallas y mantiene un área de interacción de al menos 44 píxeles. En la vista del producto, el precio, la presentación y la cantidad aparecen cerca del botón Agregar al carrito. Una barra fija conserva esa acción al desplazarse, y el carrito utiliza un ícono convencional acompañado por un contador.</w:t>
       </w:r>
     </w:p>
     <w:p>
       <w:pPr>
-        <w:pStyle w:val="BodyText"/>
+        <w:pStyle w:val="ESENBody"/>
+        <w:keepNext w:val="0"/>
+        <w:keepLines w:val="0"/>
+        <w:spacing w:line="480" w:lineRule="auto" w:before="0" w:after="0"/>
+        <w:ind w:firstLine="720"/>
+        <w:jc w:val="left"/>
       </w:pPr>
       <w:r>
+        <w:rPr>
+          <w:rFonts w:ascii="Georgia" w:hAnsi="Georgia"/>
+          <w:b w:val="0"/>
+          <w:i w:val="0"/>
+          <w:color w:val="000000"/>
+          <w:sz w:val="22"/>
+        </w:rPr>
         <w:t>La decisión se apoya en la ley de Fitts y en los principios de Jakob y reconocimiento. Los objetivos grandes y cercanos se seleccionan con menos esfuerzo. Las convenciones conocidas, como el carrito y los controles de cantidad, permiten actuar a partir de lo que la persona ya reconoce en otras tiendas.</w:t>
       </w:r>
     </w:p>
     <w:p>
       <w:pPr>
-        <w:pStyle w:val="BodyText"/>
+        <w:pStyle w:val="ESENBody"/>
+        <w:keepNext w:val="0"/>
+        <w:keepLines w:val="0"/>
+        <w:spacing w:line="480" w:lineRule="auto" w:before="0" w:after="0"/>
+        <w:ind w:firstLine="720"/>
+        <w:jc w:val="left"/>
       </w:pPr>
       <w:r>
+        <w:rPr>
+          <w:rFonts w:ascii="Georgia" w:hAnsi="Georgia"/>
+          <w:b w:val="0"/>
+          <w:i w:val="0"/>
+          <w:color w:val="000000"/>
+          <w:sz w:val="22"/>
+        </w:rPr>
         <w:t>El resultado esperado es que la acción principal se encuentre con rapidez y que cada cambio produzca retroalimentación visible. El contador del carrito, el mensaje después de agregar un producto y la confirmación final indican que el sistema recibió la acción.</w:t>
       </w:r>
     </w:p>
     <w:p>
       <w:pPr>
-        <w:pStyle w:val="Heading1"/>
+        <w:keepNext/>
+        <w:keepLines w:val="0"/>
+        <w:spacing w:line="480" w:lineRule="auto" w:before="0" w:after="0"/>
+        <w:ind w:firstLine="0"/>
+        <w:jc w:val="left"/>
       </w:pPr>
       <w:r>
+        <w:rPr>
+          <w:rFonts w:ascii="Georgia" w:hAnsi="Georgia"/>
+          <w:b/>
+          <w:i w:val="0"/>
+          <w:color w:val="000000"/>
+          <w:sz w:val="22"/>
+        </w:rPr>
         <w:t>Estados incluidos</w:t>
       </w:r>
     </w:p>
     <w:p>
       <w:pPr>
-        <w:pStyle w:val="BodyText"/>
+        <w:pStyle w:val="ESENBody"/>
+        <w:keepNext w:val="0"/>
+        <w:keepLines w:val="0"/>
+        <w:spacing w:line="480" w:lineRule="auto" w:before="0" w:after="0"/>
+        <w:ind w:firstLine="720"/>
+        <w:jc w:val="left"/>
       </w:pPr>
       <w:r>
+        <w:rPr>
+          <w:rFonts w:ascii="Georgia" w:hAnsi="Georgia"/>
+          <w:b w:val="0"/>
+          <w:i w:val="0"/>
+          <w:color w:val="000000"/>
+          <w:sz w:val="22"/>
+        </w:rPr>
         <w:t>El prototipo también muestra estados normal, hover, activo, enfoque de teclado, error, vacío y confirmación. Estos estados permiten probar el flujo completo y explican qué ocurrió sin sacar a la persona de la tarea.</w:t>
       </w:r>
     </w:p>
     <w:sectPr>
+      <w:headerReference w:type="default" r:id="rId9"/>
       <w:pgSz w:w="12240" w:h="15840"/>
-      <w:pgMar w:top="1037" w:right="1181" w:bottom="1037" w:left="1181" w:header="720" w:footer="720" w:gutter="0"/>
+      <w:pgMar w:top="1440" w:right="1440" w:bottom="1440" w:left="1440" w:header="720" w:footer="720" w:gutter="0"/>
       <w:cols w:space="720"/>
       <w:docGrid w:linePitch="360"/>
     </w:sectPr>
   </w:body>
 </w:document>
+</file>
+
+<file path=word/header1.xml><?xml version="1.0" encoding="utf-8"?>
+<w:hdr xmlns:m="http://schemas.openxmlformats.org/officeDocument/2006/math" xmlns:mc="http://schemas.openxmlformats.org/markup-compatibility/2006" xmlns:mo="http://schemas.microsoft.com/office/mac/office/2008/main" xmlns:mv="urn:schemas-microsoft-com:mac:vml" xmlns:o="urn:schemas-microsoft-com:office:office" xmlns:r="http://schemas.openxmlformats.org/officeDocument/2006/relationships" xmlns:v="urn:schemas-microsoft-com:vml" xmlns:w10="urn:schemas-microsoft-com:office:word" xmlns:w14="http://schemas.microsoft.com/office/word/2010/wordml" xmlns:w="http://schemas.openxmlformats.org/wordprocessingml/2006/main" xmlns:wne="http://schemas.microsoft.com/office/word/2006/wordml" xmlns:wp14="http://schemas.microsoft.com/office/word/2010/wordprocessingDrawing" xmlns:wp="http://schemas.openxmlformats.org/drawingml/2006/wordprocessingDrawing" xmlns:wpc="http://schemas.microsoft.com/office/word/2010/wordprocessingCanvas" xmlns:wpg="http://schemas.microsoft.com/office/word/2010/wordprocessingGroup" xmlns:wpi="http://schemas.microsoft.com/office/word/2010/wordprocessingInk" xmlns:wps="http://schemas.microsoft.com/office/word/2010/wordprocessingShape" mc:Ignorable="w14 wp14">
+  <w:p>
+    <w:pPr>
+      <w:pStyle w:val="Header"/>
+      <w:spacing w:after="0" w:line="240" w:lineRule="auto"/>
+      <w:jc w:val="right"/>
+    </w:pPr>
+    <w:r>
+      <w:rPr>
+        <w:rFonts w:ascii="Georgia" w:hAnsi="Georgia"/>
+        <w:b w:val="0"/>
+        <w:i w:val="0"/>
+        <w:color w:val="000000"/>
+        <w:sz w:val="22"/>
+      </w:rPr>
+      <w:fldChar w:fldCharType="begin"/>
+      <w:instrText xml:space="preserve"> PAGE </w:instrText>
+      <w:fldChar w:fldCharType="separate"/>
+      <w:t>1</w:t>
+      <w:fldChar w:fldCharType="end"/>
+    </w:r>
+  </w:p>
+</w:hdr>
 </file>
 
 <file path=word/numbering.xml><?xml version="1.0" encoding="utf-8"?>
@@ -499,11 +715,11 @@
     <w:qFormat/>
     <w:rsid w:val="00FC693F"/>
     <w:pPr>
-      <w:spacing w:after="140" w:line="276" w:lineRule="auto"/>
+      <w:spacing w:line="480" w:lineRule="auto" w:before="0" w:after="0"/>
     </w:pPr>
     <w:rPr>
-      <w:rFonts w:ascii="Aptos" w:hAnsi="Aptos"/>
-      <w:color w:val="1D1D1F"/>
+      <w:rFonts w:ascii="Georgia" w:hAnsi="Georgia"/>
+      <w:color w:val="000000"/>
       <w:sz w:val="22"/>
     </w:rPr>
   </w:style>
@@ -562,15 +778,15 @@
     <w:pPr>
       <w:keepNext/>
       <w:keepLines/>
-      <w:spacing w:before="300" w:after="120"/>
+      <w:spacing w:before="480" w:after="0"/>
       <w:outlineLvl w:val="0"/>
     </w:pPr>
     <w:rPr>
-      <w:rFonts w:asciiTheme="majorHAnsi" w:eastAsiaTheme="majorEastAsia" w:hAnsiTheme="majorHAnsi" w:cstheme="majorBidi" w:ascii="Aptos Display" w:hAnsi="Aptos Display"/>
+      <w:rFonts w:asciiTheme="majorHAnsi" w:eastAsiaTheme="majorEastAsia" w:hAnsiTheme="majorHAnsi" w:cstheme="majorBidi"/>
       <w:b/>
       <w:bCs/>
-      <w:color w:val="000000"/>
-      <w:sz w:val="34"/>
+      <w:color w:val="365F91" w:themeColor="accent1" w:themeShade="BF"/>
+      <w:sz w:val="28"/>
       <w:szCs w:val="28"/>
     </w:rPr>
   </w:style>
@@ -586,15 +802,15 @@
     <w:pPr>
       <w:keepNext/>
       <w:keepLines/>
-      <w:spacing w:before="160" w:after="80"/>
+      <w:spacing w:before="200" w:after="0"/>
       <w:outlineLvl w:val="1"/>
     </w:pPr>
     <w:rPr>
-      <w:rFonts w:asciiTheme="majorHAnsi" w:eastAsiaTheme="majorEastAsia" w:hAnsiTheme="majorHAnsi" w:cstheme="majorBidi" w:ascii="Aptos" w:hAnsi="Aptos"/>
+      <w:rFonts w:asciiTheme="majorHAnsi" w:eastAsiaTheme="majorEastAsia" w:hAnsiTheme="majorHAnsi" w:cstheme="majorBidi"/>
       <w:b/>
       <w:bCs/>
-      <w:color w:val="000000"/>
-      <w:sz w:val="24"/>
+      <w:color w:val="4F81BD" w:themeColor="accent1"/>
+      <w:sz w:val="26"/>
       <w:szCs w:val="26"/>
     </w:rPr>
   </w:style>
@@ -848,16 +1064,18 @@
     <w:qFormat/>
     <w:rsid w:val="00FC693F"/>
     <w:pPr>
-      <w:spacing w:after="160" w:line="240" w:lineRule="auto"/>
+      <w:pBdr>
+        <w:bottom w:val="single" w:sz="8" w:space="4" w:color="4F81BD" w:themeColor="accent1"/>
+      </w:pBdr>
+      <w:spacing w:after="300" w:line="240" w:lineRule="auto"/>
       <w:contextualSpacing/>
     </w:pPr>
     <w:rPr>
-      <w:rFonts w:asciiTheme="majorHAnsi" w:eastAsiaTheme="majorEastAsia" w:hAnsiTheme="majorHAnsi" w:cstheme="majorBidi" w:ascii="Aptos Display" w:hAnsi="Aptos Display"/>
-      <w:b/>
-      <w:color w:val="000000"/>
+      <w:rFonts w:asciiTheme="majorHAnsi" w:eastAsiaTheme="majorEastAsia" w:hAnsiTheme="majorHAnsi" w:cstheme="majorBidi"/>
+      <w:color w:val="17365D" w:themeColor="text2" w:themeShade="BF"/>
       <w:spacing w:val="5"/>
       <w:kern w:val="28"/>
-      <w:sz w:val="54"/>
+      <w:sz w:val="52"/>
       <w:szCs w:val="52"/>
     </w:rPr>
   </w:style>
@@ -934,13 +1152,8 @@
     <w:unhideWhenUsed/>
     <w:rsid w:val="00AA1D8D"/>
     <w:pPr>
-      <w:spacing w:after="160" w:line="276" w:lineRule="auto"/>
-    </w:pPr>
-    <w:rPr>
-      <w:rFonts w:ascii="Aptos" w:hAnsi="Aptos"/>
-      <w:color w:val="1D1D1F"/>
-      <w:sz w:val="22"/>
-    </w:rPr>
+      <w:spacing w:after="120"/>
+    </w:pPr>
   </w:style>
   <w:style w:type="character" w:customStyle="1" w:styleId="BodyTextChar">
     <w:name w:val="Body Text Char"/>
@@ -12191,6 +12404,18 @@
         <w:shd w:val="clear" w:color="auto" w:fill="FBCAA2" w:themeFill="accent6" w:themeFillTint="7F"/>
       </w:tcPr>
     </w:tblStylePr>
+  </w:style>
+  <w:style w:type="paragraph" w:customStyle="1" w:styleId="ESENBody">
+    <w:name w:val="ESEN Body"/>
+    <w:basedOn w:val="Normal"/>
+    <w:pPr>
+      <w:spacing w:line="480" w:lineRule="auto" w:before="0" w:after="0"/>
+      <w:ind w:firstLine="720"/>
+    </w:pPr>
+    <w:rPr>
+      <w:rFonts w:ascii="Georgia" w:hAnsi="Georgia"/>
+      <w:sz w:val="22"/>
+    </w:rPr>
   </w:style>
 </w:styles>
 </file>

</xml_diff>